<commit_message>
Atualiza notebook e resultados da análise
</commit_message>
<xml_diff>
--- a/resultados_analise/2_Idosos_Saudaveis/estatisticas.docx
+++ b/resultados_analise/2_Idosos_Saudaveis/estatisticas.docx
@@ -66,7 +66,7 @@
           </w:tcPr>
           <w:p>
             <w:r>
-              <w:t>476</w:t>
+              <w:t>2807</w:t>
             </w:r>
           </w:p>
         </w:tc>
@@ -88,7 +88,7 @@
           </w:tcPr>
           <w:p>
             <w:r>
-              <w:t>1185</w:t>
+              <w:t>6327</w:t>
             </w:r>
           </w:p>
         </w:tc>
@@ -110,7 +110,7 @@
           </w:tcPr>
           <w:p>
             <w:r>
-              <w:t>825</w:t>
+              <w:t>4731</w:t>
             </w:r>
           </w:p>
         </w:tc>
@@ -132,7 +132,7 @@
           </w:tcPr>
           <w:p>
             <w:r>
-              <w:t>837</w:t>
+              <w:t>3830</w:t>
             </w:r>
           </w:p>
         </w:tc>
@@ -154,7 +154,7 @@
           </w:tcPr>
           <w:p>
             <w:r>
-              <w:t>550</w:t>
+              <w:t>2739</w:t>
             </w:r>
           </w:p>
         </w:tc>
@@ -216,7 +216,7 @@
           </w:tcPr>
           <w:p>
             <w:r>
-              <w:t>103</w:t>
+              <w:t>549</w:t>
             </w:r>
           </w:p>
         </w:tc>
@@ -238,7 +238,7 @@
           </w:tcPr>
           <w:p>
             <w:r>
-              <w:t>140</w:t>
+              <w:t>724</w:t>
             </w:r>
           </w:p>
         </w:tc>
@@ -260,7 +260,7 @@
           </w:tcPr>
           <w:p>
             <w:r>
-              <w:t>66</w:t>
+              <w:t>443</w:t>
             </w:r>
           </w:p>
         </w:tc>
@@ -282,7 +282,7 @@
           </w:tcPr>
           <w:p>
             <w:r>
-              <w:t>170</w:t>
+              <w:t>1021</w:t>
             </w:r>
           </w:p>
         </w:tc>
@@ -304,7 +304,7 @@
           </w:tcPr>
           <w:p>
             <w:r>
-              <w:t>173</w:t>
+              <w:t>952</w:t>
             </w:r>
           </w:p>
         </w:tc>
@@ -326,7 +326,7 @@
           </w:tcPr>
           <w:p>
             <w:r>
-              <w:t>203</w:t>
+              <w:t>929</w:t>
             </w:r>
           </w:p>
         </w:tc>
@@ -348,7 +348,7 @@
           </w:tcPr>
           <w:p>
             <w:r>
-              <w:t>96</w:t>
+              <w:t>722</w:t>
             </w:r>
           </w:p>
         </w:tc>
@@ -370,7 +370,7 @@
           </w:tcPr>
           <w:p>
             <w:r>
-              <w:t>166</w:t>
+              <w:t>886</w:t>
             </w:r>
           </w:p>
         </w:tc>
@@ -392,7 +392,7 @@
           </w:tcPr>
           <w:p>
             <w:r>
-              <w:t>115</w:t>
+              <w:t>635</w:t>
             </w:r>
           </w:p>
         </w:tc>
@@ -414,7 +414,7 @@
           </w:tcPr>
           <w:p>
             <w:r>
-              <w:t>239</w:t>
+              <w:t>1284</w:t>
             </w:r>
           </w:p>
         </w:tc>
@@ -436,7 +436,7 @@
           </w:tcPr>
           <w:p>
             <w:r>
-              <w:t>121</w:t>
+              <w:t>735</w:t>
             </w:r>
           </w:p>
         </w:tc>
@@ -458,7 +458,7 @@
           </w:tcPr>
           <w:p>
             <w:r>
-              <w:t>144</w:t>
+              <w:t>715</w:t>
             </w:r>
           </w:p>
         </w:tc>
@@ -480,7 +480,7 @@
           </w:tcPr>
           <w:p>
             <w:r>
-              <w:t>240</w:t>
+              <w:t>1229</w:t>
             </w:r>
           </w:p>
         </w:tc>
@@ -502,7 +502,7 @@
           </w:tcPr>
           <w:p>
             <w:r>
-              <w:t>204</w:t>
+              <w:t>972</w:t>
             </w:r>
           </w:p>
         </w:tc>
@@ -524,7 +524,7 @@
           </w:tcPr>
           <w:p>
             <w:r>
-              <w:t>139</w:t>
+              <w:t>788</w:t>
             </w:r>
           </w:p>
         </w:tc>
@@ -546,7 +546,7 @@
           </w:tcPr>
           <w:p>
             <w:r>
-              <w:t>198</w:t>
+              <w:t>1014</w:t>
             </w:r>
           </w:p>
         </w:tc>
@@ -568,7 +568,7 @@
           </w:tcPr>
           <w:p>
             <w:r>
-              <w:t>200</w:t>
+              <w:t>1078</w:t>
             </w:r>
           </w:p>
         </w:tc>
@@ -590,7 +590,7 @@
           </w:tcPr>
           <w:p>
             <w:r>
-              <w:t>154</w:t>
+              <w:t>688</w:t>
             </w:r>
           </w:p>
         </w:tc>
@@ -612,7 +612,7 @@
           </w:tcPr>
           <w:p>
             <w:r>
-              <w:t>134</w:t>
+              <w:t>706</w:t>
             </w:r>
           </w:p>
         </w:tc>
@@ -634,7 +634,7 @@
           </w:tcPr>
           <w:p>
             <w:r>
-              <w:t>171</w:t>
+              <w:t>794</w:t>
             </w:r>
           </w:p>
         </w:tc>
@@ -656,7 +656,7 @@
           </w:tcPr>
           <w:p>
             <w:r>
-              <w:t>322</w:t>
+              <w:t>1180</w:t>
             </w:r>
           </w:p>
         </w:tc>
@@ -678,7 +678,7 @@
           </w:tcPr>
           <w:p>
             <w:r>
-              <w:t>94</w:t>
+              <w:t>589</w:t>
             </w:r>
           </w:p>
         </w:tc>
@@ -700,7 +700,7 @@
           </w:tcPr>
           <w:p>
             <w:r>
-              <w:t>89</w:t>
+              <w:t>637</w:t>
             </w:r>
           </w:p>
         </w:tc>
@@ -722,7 +722,7 @@
           </w:tcPr>
           <w:p>
             <w:r>
-              <w:t>175</w:t>
+              <w:t>973</w:t>
             </w:r>
           </w:p>
         </w:tc>
@@ -744,7 +744,7 @@
           </w:tcPr>
           <w:p>
             <w:r>
-              <w:t>96</w:t>
+              <w:t>654</w:t>
             </w:r>
           </w:p>
         </w:tc>
@@ -766,7 +766,7 @@
           </w:tcPr>
           <w:p>
             <w:r>
-              <w:t>275</w:t>
+              <w:t>1421</w:t>
             </w:r>
           </w:p>
         </w:tc>
@@ -788,7 +788,7 @@
           </w:tcPr>
           <w:p>
             <w:r>
-              <w:t>105</w:t>
+              <w:t>478</w:t>
             </w:r>
           </w:p>
         </w:tc>

</xml_diff>